<commit_message>
[20260519] Push v2 clase clasificación
</commit_message>
<xml_diff>
--- a/04_TAREAS/TAREA 02 Regresion/preguntas_finales_t3.docx
+++ b/04_TAREAS/TAREA 02 Regresion/preguntas_finales_t3.docx
@@ -3038,7 +3038,52 @@
           <w:rFonts w:ascii="Ubuntu" w:hAnsi="Ubuntu"/>
           <w:lang w:val="es-ES"/>
         </w:rPr>
-        <w:t xml:space="preserve"> de sesiones de entrenamiento. Cada fila es una sesión individual con las siguientes columnas:</w:t>
+        <w:t xml:space="preserve"> de sesiones de entrenamiento. </w:t>
+      </w:r>
+      <w:r>
+        <w:rPr>
+          <w:rFonts w:ascii="Ubuntu" w:hAnsi="Ubuntu"/>
+          <w:lang w:val="es-ES"/>
+        </w:rPr>
+        <w:t xml:space="preserve">El archivo lo puede descargar en </w:t>
+      </w:r>
+      <w:hyperlink r:id="rId5" w:history="1">
+        <w:r>
+          <w:rPr>
+            <w:rStyle w:val="Hipervnculo"/>
+            <w:rFonts w:ascii="Ubuntu" w:hAnsi="Ubuntu"/>
+            <w:lang w:val="es-ES"/>
+          </w:rPr>
+          <w:t>https://raw.githubusercontent.com/JuveCampos/TC2001B.601-Ciencia-de-datos-ene-jun-2026/refs/heads/main/04_TAREAS/TAREA%2002%20Regresion/sesiones_gimnasio.csv</w:t>
+        </w:r>
+      </w:hyperlink>
+      <w:r>
+        <w:rPr>
+          <w:rFonts w:ascii="Ubuntu" w:hAnsi="Ubuntu"/>
+          <w:lang w:val="es-ES"/>
+        </w:rPr>
+        <w:t xml:space="preserve"> . </w:t>
+      </w:r>
+      <w:r>
+        <w:rPr>
+          <w:rFonts w:ascii="Ubuntu" w:hAnsi="Ubuntu"/>
+          <w:lang w:val="es-ES"/>
+        </w:rPr>
+        <w:t xml:space="preserve">Cada fila es una sesión </w:t>
+      </w:r>
+      <w:r>
+        <w:rPr>
+          <w:rFonts w:ascii="Ubuntu" w:hAnsi="Ubuntu"/>
+          <w:lang w:val="es-ES"/>
+        </w:rPr>
+        <w:t xml:space="preserve">de gimnasio </w:t>
+      </w:r>
+      <w:r>
+        <w:rPr>
+          <w:rFonts w:ascii="Ubuntu" w:hAnsi="Ubuntu"/>
+          <w:lang w:val="es-ES"/>
+        </w:rPr>
+        <w:t>individual con las siguientes columnas:</w:t>
       </w:r>
     </w:p>
     <w:tbl>
@@ -4394,6 +4439,7 @@
           <w:bCs/>
           <w:lang w:val="es-ES"/>
         </w:rPr>
+        <w:lastRenderedPageBreak/>
         <w:t>Nota:</w:t>
       </w:r>
       <w:r>
@@ -4437,7 +4483,6 @@
           <w:bCs/>
           <w:lang w:val="es-ES"/>
         </w:rPr>
-        <w:lastRenderedPageBreak/>
         <w:t xml:space="preserve">Nota 2. </w:t>
       </w:r>
       <w:r>
@@ -5453,6 +5498,7 @@
           <w:bCs/>
           <w:lang w:val="es-ES"/>
         </w:rPr>
+        <w:lastRenderedPageBreak/>
         <w:t>Codificar</w:t>
       </w:r>
       <w:r>
@@ -5493,7 +5539,6 @@
           <w:rFonts w:ascii="Ubuntu" w:hAnsi="Ubuntu"/>
           <w:lang w:val="es-ES"/>
         </w:rPr>
-        <w:lastRenderedPageBreak/>
         <w:t xml:space="preserve">Entrena la receta con </w:t>
       </w:r>
       <w:r>
@@ -6264,7 +6309,7 @@
           <w:lang w:val="es-ES"/>
           <w14:ligatures w14:val="standardContextual"/>
         </w:rPr>
-        <w:pict w14:anchorId="4B4F2E26">
+        <w:pict w14:anchorId="7DCE6DCD">
           <v:rect id="_x0000_i1025" alt="" style="width:441.9pt;height:.05pt;mso-width-percent:0;mso-height-percent:0;mso-width-percent:0;mso-height-percent:0" o:hralign="center" o:hrstd="t" o:hr="t"/>
         </w:pict>
       </w:r>
@@ -6497,7 +6542,38 @@
           <w:rFonts w:ascii="Ubuntu" w:hAnsi="Ubuntu"/>
           <w:lang w:val="es-ES"/>
         </w:rPr>
-        <w:t>. Cada fila es una póliza individual con las siguientes columnas:</w:t>
+        <w:t xml:space="preserve">. </w:t>
+      </w:r>
+      <w:r>
+        <w:rPr>
+          <w:rFonts w:ascii="Ubuntu" w:hAnsi="Ubuntu"/>
+          <w:lang w:val="es-ES"/>
+        </w:rPr>
+        <w:t xml:space="preserve">El dataset lo puede descargar acá: </w:t>
+      </w:r>
+      <w:hyperlink r:id="rId6" w:history="1">
+        <w:r>
+          <w:rPr>
+            <w:rStyle w:val="Hipervnculo"/>
+            <w:rFonts w:ascii="Ubuntu" w:hAnsi="Ubuntu"/>
+            <w:lang w:val="es-ES"/>
+          </w:rPr>
+          <w:t>https://raw.githubusercontent.com/JuveCampos/TC2001B.601-Ciencia-de-datos-ene-jun-2026/refs/heads/main/04_TAREAS/TAREA%2002%20Regresion/seguros_auto.csv</w:t>
+        </w:r>
+      </w:hyperlink>
+      <w:r>
+        <w:rPr>
+          <w:rFonts w:ascii="Ubuntu" w:hAnsi="Ubuntu"/>
+          <w:lang w:val="es-ES"/>
+        </w:rPr>
+        <w:t xml:space="preserve"> . </w:t>
+      </w:r>
+      <w:r>
+        <w:rPr>
+          <w:rFonts w:ascii="Ubuntu" w:hAnsi="Ubuntu"/>
+          <w:lang w:val="es-ES"/>
+        </w:rPr>
+        <w:t>Cada fila es una póliza individual con las siguientes columnas:</w:t>
       </w:r>
     </w:p>
     <w:tbl>
@@ -8198,6 +8274,7 @@
           <w:szCs w:val="24"/>
           <w:lang w:val="es-ES"/>
         </w:rPr>
+        <w:lastRenderedPageBreak/>
         <w:t>2. División entrenamiento / prueba (10 puntos)</w:t>
       </w:r>
     </w:p>
@@ -8327,7 +8404,6 @@
           <w:szCs w:val="24"/>
           <w:lang w:val="es-ES"/>
         </w:rPr>
-        <w:lastRenderedPageBreak/>
         <w:t>3. Exploración previa (15 puntos)</w:t>
       </w:r>
     </w:p>
@@ -9305,6 +9381,7 @@
           <w:rFonts w:ascii="Ubuntu" w:hAnsi="Ubuntu"/>
           <w:lang w:val="es-ES"/>
         </w:rPr>
+        <w:lastRenderedPageBreak/>
         <w:t xml:space="preserve">Extrae e interpreta los coeficientes ordenados por </w:t>
       </w:r>
       <w:r>
@@ -9396,7 +9473,6 @@
           <w:bCs/>
           <w:lang w:val="es-ES"/>
         </w:rPr>
-        <w:lastRenderedPageBreak/>
         <w:t>Gráfico predicho vs real:</w:t>
       </w:r>
       <w:r>
@@ -10790,6 +10866,29 @@
       </w:tcPr>
     </w:tblStylePr>
   </w:style>
+  <w:style w:type="character" w:styleId="Hipervnculo">
+    <w:name w:val="Hyperlink"/>
+    <w:basedOn w:val="Fuentedeprrafopredeter"/>
+    <w:uiPriority w:val="99"/>
+    <w:unhideWhenUsed/>
+    <w:rsid w:val="00871343"/>
+    <w:rPr>
+      <w:color w:val="467886" w:themeColor="hyperlink"/>
+      <w:u w:val="single"/>
+    </w:rPr>
+  </w:style>
+  <w:style w:type="character" w:styleId="Mencinsinresolver">
+    <w:name w:val="Unresolved Mention"/>
+    <w:basedOn w:val="Fuentedeprrafopredeter"/>
+    <w:uiPriority w:val="99"/>
+    <w:semiHidden/>
+    <w:unhideWhenUsed/>
+    <w:rsid w:val="00871343"/>
+    <w:rPr>
+      <w:color w:val="605E5C"/>
+      <w:shd w:val="clear" w:color="auto" w:fill="E1DFDD"/>
+    </w:rPr>
+  </w:style>
 </w:styles>
 </file>
 

</xml_diff>